<commit_message>
Implemented and tested branching instructions
</commit_message>
<xml_diff>
--- a/Project One - Milestone Two - Ahmed S. Mohammed's Journal.docx
+++ b/Project One - Milestone Two - Ahmed S. Mohammed's Journal.docx
@@ -911,102 +911,108 @@
         <w:t>45</w:t>
       </w:r>
       <w:r>
-        <w:t xml:space="preserve"> AM – </w:t>
-      </w:r>
-      <w:r>
-        <w:t>END</w:t>
-      </w:r>
-      <w:r>
-        <w:t>)</w:t>
-      </w:r>
-    </w:p>
-    <w:p>
-      <w:r>
-        <w:t xml:space="preserve">Implementation of the </w:t>
-      </w:r>
-      <w:r>
-        <w:t>branch instructions. This includes:</w:t>
-      </w:r>
-    </w:p>
-    <w:p>
-      <w:pPr>
-        <w:pStyle w:val="ListBullet"/>
-        <w:tabs>
-          <w:tab w:val="clear" w:pos="360"/>
-          <w:tab w:val="num" w:pos="1080"/>
-        </w:tabs>
-        <w:ind w:left="1080"/>
-      </w:pPr>
-      <w:r>
-        <w:t>BEQ</w:t>
-      </w:r>
-    </w:p>
-    <w:p>
-      <w:pPr>
-        <w:pStyle w:val="ListBullet"/>
-        <w:tabs>
-          <w:tab w:val="clear" w:pos="360"/>
-          <w:tab w:val="num" w:pos="1080"/>
-        </w:tabs>
-        <w:ind w:left="1080"/>
-      </w:pPr>
-      <w:r>
-        <w:t>BNE</w:t>
-      </w:r>
-    </w:p>
-    <w:p>
-      <w:pPr>
-        <w:pStyle w:val="ListBullet"/>
-        <w:tabs>
-          <w:tab w:val="clear" w:pos="360"/>
-          <w:tab w:val="num" w:pos="1080"/>
-        </w:tabs>
-        <w:ind w:left="1080"/>
-      </w:pPr>
-      <w:r>
-        <w:t>BLT</w:t>
-      </w:r>
-    </w:p>
-    <w:p>
-      <w:pPr>
-        <w:pStyle w:val="ListBullet"/>
-        <w:tabs>
-          <w:tab w:val="clear" w:pos="360"/>
-          <w:tab w:val="num" w:pos="1080"/>
-        </w:tabs>
-        <w:ind w:left="1080"/>
-      </w:pPr>
-      <w:r>
-        <w:t>BGE</w:t>
-      </w:r>
-    </w:p>
-    <w:p>
-      <w:pPr>
-        <w:pStyle w:val="ListBullet"/>
-        <w:tabs>
-          <w:tab w:val="clear" w:pos="360"/>
-          <w:tab w:val="num" w:pos="1080"/>
-        </w:tabs>
-        <w:ind w:left="1080"/>
-      </w:pPr>
-      <w:r>
-        <w:t>BLTU</w:t>
-      </w:r>
-    </w:p>
-    <w:p>
-      <w:pPr>
-        <w:pStyle w:val="ListBullet"/>
-        <w:tabs>
-          <w:tab w:val="clear" w:pos="360"/>
-          <w:tab w:val="num" w:pos="1080"/>
-        </w:tabs>
-        <w:ind w:left="1080"/>
-      </w:pPr>
-      <w:r>
-        <w:t>BGEU</w:t>
+        <w:t xml:space="preserve"> AM –</w:t>
+      </w:r>
+      <w:r>
+        <w:t xml:space="preserve"> 12:00 PM</w:t>
       </w:r>
       <w:bookmarkStart w:id="0" w:name="_GoBack"/>
       <w:bookmarkEnd w:id="0"/>
+      <w:r>
+        <w:t>)</w:t>
+      </w:r>
+    </w:p>
+    <w:p>
+      <w:r>
+        <w:t>Implementation</w:t>
+      </w:r>
+      <w:r>
+        <w:t xml:space="preserve"> and testing</w:t>
+      </w:r>
+      <w:r>
+        <w:t xml:space="preserve"> of the </w:t>
+      </w:r>
+      <w:r>
+        <w:t>branch instructions. This includes:</w:t>
+      </w:r>
+    </w:p>
+    <w:p>
+      <w:pPr>
+        <w:pStyle w:val="ListBullet"/>
+        <w:tabs>
+          <w:tab w:val="clear" w:pos="360"/>
+          <w:tab w:val="num" w:pos="1080"/>
+        </w:tabs>
+        <w:ind w:left="1080"/>
+      </w:pPr>
+      <w:r>
+        <w:t>BEQ</w:t>
+      </w:r>
+    </w:p>
+    <w:p>
+      <w:pPr>
+        <w:pStyle w:val="ListBullet"/>
+        <w:tabs>
+          <w:tab w:val="clear" w:pos="360"/>
+          <w:tab w:val="num" w:pos="1080"/>
+        </w:tabs>
+        <w:ind w:left="1080"/>
+      </w:pPr>
+      <w:r>
+        <w:t>BNE</w:t>
+      </w:r>
+    </w:p>
+    <w:p>
+      <w:pPr>
+        <w:pStyle w:val="ListBullet"/>
+        <w:tabs>
+          <w:tab w:val="clear" w:pos="360"/>
+          <w:tab w:val="num" w:pos="1080"/>
+        </w:tabs>
+        <w:ind w:left="1080"/>
+      </w:pPr>
+      <w:r>
+        <w:t>BLT</w:t>
+      </w:r>
+    </w:p>
+    <w:p>
+      <w:pPr>
+        <w:pStyle w:val="ListBullet"/>
+        <w:tabs>
+          <w:tab w:val="clear" w:pos="360"/>
+          <w:tab w:val="num" w:pos="1080"/>
+        </w:tabs>
+        <w:ind w:left="1080"/>
+      </w:pPr>
+      <w:r>
+        <w:t>BGE</w:t>
+      </w:r>
+    </w:p>
+    <w:p>
+      <w:pPr>
+        <w:pStyle w:val="ListBullet"/>
+        <w:tabs>
+          <w:tab w:val="clear" w:pos="360"/>
+          <w:tab w:val="num" w:pos="1080"/>
+        </w:tabs>
+        <w:ind w:left="1080"/>
+      </w:pPr>
+      <w:r>
+        <w:t>BLTU</w:t>
+      </w:r>
+    </w:p>
+    <w:p>
+      <w:pPr>
+        <w:pStyle w:val="ListBullet"/>
+        <w:tabs>
+          <w:tab w:val="clear" w:pos="360"/>
+          <w:tab w:val="num" w:pos="1080"/>
+        </w:tabs>
+        <w:ind w:left="1080"/>
+      </w:pPr>
+      <w:r>
+        <w:t>BGEU</w:t>
+      </w:r>
     </w:p>
     <w:p>
       <w:pPr>
@@ -1077,7 +1083,7 @@
   <w:abstractNum w:abstractNumId="0" w15:restartNumberingAfterBreak="0">
     <w:nsid w:val="FFFFFF89"/>
     <w:multiLevelType w:val="singleLevel"/>
-    <w:tmpl w:val="E500C8E0"/>
+    <w:tmpl w:val="5D4494FA"/>
     <w:lvl w:ilvl="0">
       <w:start w:val="1"/>
       <w:numFmt w:val="bullet"/>

</xml_diff>